<commit_message>
REQ-031 Session B (1): section 5 of every sheet gains "Check your systems before the audit" (FR-4, AC-9; D-2889)
The content file's next list carries the third step after the checklist
and the audit day; the Word file, the page and the sample read it from
there. The route /path/audit-day/check exists (D-2889's UNVERIFIED
resolved). The sole-trader evidence sheet and its Word file regenerated.

Co-Authored-By: Claude Fable 5.1 <noreply@anthropic.com>
</commit_message>
<xml_diff>
--- a/product/evidence/req-026/00-start-here.docx
+++ b/product/evidence/req-026/00-start-here.docx
@@ -60,7 +60,7 @@
         <w:rPr>
           <w:rFonts w:ascii="Calibri" w:cs="Calibri" w:eastAsia="Calibri" w:hAnsi="Calibri"/>
         </w:rPr>
-        <w:t xml:space="preserve">Your audit: verification (an auditor checks your documents at a desk; nobody visits).</w:t>
+        <w:t xml:space="preserve">Your audit: verification (an approved auditor checks your documents without coming to see you).</w:t>
       </w:r>
     </w:p>
     <w:p>
@@ -156,23 +156,23 @@
         <w:rPr>
           <w:rFonts w:ascii="Calibri" w:cs="Calibri" w:eastAsia="Calibri" w:hAnsi="Calibri"/>
         </w:rPr>
-        <w:t xml:space="preserve">self-assessment: the form where you say how you meet each rule.</w:t>
-      </w:r>
-    </w:p>
-    <w:p>
-      <w:pPr>
-        <w:pStyle w:val="ListParagraph"/>
-        <w:numPr>
-          <w:ilvl w:val="0"/>
-          <w:numId w:val="2"/>
-        </w:numPr>
-        <w:spacing w:after="60" w:line="276"/>
-      </w:pPr>
-      <w:r>
-        <w:rPr>
-          <w:rFonts w:ascii="Calibri" w:cs="Calibri" w:eastAsia="Calibri" w:hAnsi="Calibri"/>
-        </w:rPr>
-        <w:t xml:space="preserve">adopt: sign and date a document so it is yours.</w:t>
+        <w:t xml:space="preserve">self-assessment: the part of your application where you show, with evidence, how you meet each rule.</w:t>
+      </w:r>
+    </w:p>
+    <w:p>
+      <w:pPr>
+        <w:pStyle w:val="ListParagraph"/>
+        <w:numPr>
+          <w:ilvl w:val="0"/>
+          <w:numId w:val="2"/>
+        </w:numPr>
+        <w:spacing w:after="60" w:line="276"/>
+      </w:pPr>
+      <w:r>
+        <w:rPr>
+          <w:rFonts w:ascii="Calibri" w:cs="Calibri" w:eastAsia="Calibri" w:hAnsi="Calibri"/>
+        </w:rPr>
+        <w:t xml:space="preserve">adopt: take a document as your own and date it.</w:t>
       </w:r>
     </w:p>
     <w:p>
@@ -1783,7 +1783,7 @@
         <w:rPr>
           <w:rFonts w:ascii="Calibri" w:cs="Calibri" w:eastAsia="Calibri" w:hAnsi="Calibri"/>
         </w:rPr>
-        <w:t xml:space="preserve">☐ Fill in Word: Easy Read version: </w:t>
+        <w:t xml:space="preserve">☐ Fill in Word: Section 8, Complaints register: </w:t>
       </w:r>
       <w:r>
         <w:rPr>
@@ -1792,7 +1792,7 @@
           <w:szCs w:val="24"/>
           <w:shd w:fill="FBE9D7" w:val="clear"/>
         </w:rPr>
-        <w:t xml:space="preserve">[Easy Read version]</w:t>
+        <w:t xml:space="preserve">[Code]</w:t>
       </w:r>
       <w:r>
         <w:rPr>
@@ -1823,7 +1823,7 @@
           <w:szCs w:val="24"/>
           <w:shd w:fill="FBE9D7" w:val="clear"/>
         </w:rPr>
-        <w:t xml:space="preserve">[Code]</w:t>
+        <w:t xml:space="preserve">[Summary]</w:t>
       </w:r>
       <w:r>
         <w:rPr>
@@ -1845,7 +1845,162 @@
         <w:rPr>
           <w:rFonts w:ascii="Calibri" w:cs="Calibri" w:eastAsia="Calibri" w:hAnsi="Calibri"/>
         </w:rPr>
-        <w:t xml:space="preserve">☐ Fill in Word: Section 8, Complaints register: </w:t>
+        <w:t xml:space="preserve">☐ Make it yours: Section 1, Purpose (generic text: add your details)</w:t>
+      </w:r>
+    </w:p>
+    <w:p>
+      <w:pPr>
+        <w:pStyle w:val="ListParagraph"/>
+        <w:numPr>
+          <w:ilvl w:val="0"/>
+          <w:numId w:val="2"/>
+        </w:numPr>
+        <w:spacing w:after="60" w:line="276"/>
+      </w:pPr>
+      <w:r>
+        <w:rPr>
+          <w:rFonts w:ascii="Calibri" w:cs="Calibri" w:eastAsia="Calibri" w:hAnsi="Calibri"/>
+        </w:rPr>
+        <w:t xml:space="preserve">☐ Make it yours: Section 2, Scope (generic text: add your details)</w:t>
+      </w:r>
+    </w:p>
+    <w:p>
+      <w:pPr>
+        <w:pStyle w:val="ListParagraph"/>
+        <w:numPr>
+          <w:ilvl w:val="0"/>
+          <w:numId w:val="2"/>
+        </w:numPr>
+        <w:spacing w:after="60" w:line="276"/>
+      </w:pPr>
+      <w:r>
+        <w:rPr>
+          <w:rFonts w:ascii="Calibri" w:cs="Calibri" w:eastAsia="Calibri" w:hAnsi="Calibri"/>
+        </w:rPr>
+        <w:t xml:space="preserve">☐ Make it yours: Section 4, Policy statement (generic text: add your details)</w:t>
+      </w:r>
+    </w:p>
+    <w:p>
+      <w:pPr>
+        <w:pStyle w:val="ListParagraph"/>
+        <w:numPr>
+          <w:ilvl w:val="0"/>
+          <w:numId w:val="2"/>
+        </w:numPr>
+        <w:spacing w:after="60" w:line="276"/>
+      </w:pPr>
+      <w:r>
+        <w:rPr>
+          <w:rFonts w:ascii="Calibri" w:cs="Calibri" w:eastAsia="Calibri" w:hAnsi="Calibri"/>
+        </w:rPr>
+        <w:t xml:space="preserve">☐ Make it yours: Section 5, How we put this into practice (generic text: add your details)</w:t>
+      </w:r>
+    </w:p>
+    <w:p>
+      <w:pPr>
+        <w:pStyle w:val="ListParagraph"/>
+        <w:numPr>
+          <w:ilvl w:val="0"/>
+          <w:numId w:val="2"/>
+        </w:numPr>
+        <w:spacing w:after="60" w:line="276"/>
+      </w:pPr>
+      <w:r>
+        <w:rPr>
+          <w:rFonts w:ascii="Calibri" w:cs="Calibri" w:eastAsia="Calibri" w:hAnsi="Calibri"/>
+        </w:rPr>
+        <w:t xml:space="preserve">☐ Make it yours: Section 6, Responsibilities (generic text: add your details)</w:t>
+      </w:r>
+    </w:p>
+    <w:p>
+      <w:pPr>
+        <w:pStyle w:val="ListParagraph"/>
+        <w:numPr>
+          <w:ilvl w:val="0"/>
+          <w:numId w:val="2"/>
+        </w:numPr>
+        <w:spacing w:after="60" w:line="276"/>
+      </w:pPr>
+      <w:r>
+        <w:rPr>
+          <w:rFonts w:ascii="Calibri" w:cs="Calibri" w:eastAsia="Calibri" w:hAnsi="Calibri"/>
+        </w:rPr>
+        <w:t xml:space="preserve">☐ Make it yours: Section 7, Complaints procedure (generic text: add your details)</w:t>
+      </w:r>
+    </w:p>
+    <w:p>
+      <w:pPr>
+        <w:pStyle w:val="ListParagraph"/>
+        <w:numPr>
+          <w:ilvl w:val="0"/>
+          <w:numId w:val="2"/>
+        </w:numPr>
+        <w:spacing w:after="60" w:line="276"/>
+      </w:pPr>
+      <w:r>
+        <w:rPr>
+          <w:rFonts w:ascii="Calibri" w:cs="Calibri" w:eastAsia="Calibri" w:hAnsi="Calibri"/>
+        </w:rPr>
+        <w:t xml:space="preserve">Read once: fixed text in sections 3, 8 to 11.</w:t>
+      </w:r>
+    </w:p>
+    <w:p>
+      <w:pPr>
+        <w:pStyle w:val="ListParagraph"/>
+        <w:numPr>
+          <w:ilvl w:val="0"/>
+          <w:numId w:val="2"/>
+        </w:numPr>
+        <w:spacing w:after="60" w:line="276"/>
+      </w:pPr>
+      <w:r>
+        <w:rPr>
+          <w:rFonts w:ascii="Calibri" w:cs="Calibri" w:eastAsia="Calibri" w:hAnsi="Calibri"/>
+        </w:rPr>
+        <w:t xml:space="preserve">☐ Adopt: sign and date the document control table, then mark it adopted on your documents page.</w:t>
+      </w:r>
+    </w:p>
+    <w:p>
+      <w:pPr>
+        <w:spacing w:after="120" w:line="276"/>
+      </w:pPr>
+      <w:r>
+        <w:rPr>
+          <w:rFonts w:ascii="Calibri" w:cs="Calibri" w:eastAsia="Calibri" w:hAnsi="Calibri"/>
+        </w:rPr>
+        <w:t xml:space="preserve">8. Incident management policy, procedure and register (about 30 minutes; 1 to fill in, 0 to review)</w:t>
+      </w:r>
+    </w:p>
+    <w:p>
+      <w:pPr>
+        <w:pStyle w:val="ListParagraph"/>
+        <w:numPr>
+          <w:ilvl w:val="0"/>
+          <w:numId w:val="2"/>
+        </w:numPr>
+        <w:spacing w:after="60" w:line="276"/>
+      </w:pPr>
+      <w:r>
+        <w:rPr>
+          <w:rFonts w:ascii="Calibri" w:cs="Calibri" w:eastAsia="Calibri" w:hAnsi="Calibri"/>
+        </w:rPr>
+        <w:t xml:space="preserve">Open: incident-management-policy-and-register.docx</w:t>
+      </w:r>
+    </w:p>
+    <w:p>
+      <w:pPr>
+        <w:pStyle w:val="ListParagraph"/>
+        <w:numPr>
+          <w:ilvl w:val="0"/>
+          <w:numId w:val="2"/>
+        </w:numPr>
+        <w:spacing w:after="60" w:line="276"/>
+      </w:pPr>
+      <w:r>
+        <w:rPr>
+          <w:rFonts w:ascii="Calibri" w:cs="Calibri" w:eastAsia="Calibri" w:hAnsi="Calibri"/>
+        </w:rPr>
+        <w:t xml:space="preserve">☐ Fill in: Section 9, Incident register: </w:t>
       </w:r>
       <w:r>
         <w:rPr>
@@ -1854,184 +2009,23 @@
           <w:szCs w:val="24"/>
           <w:shd w:fill="FBE9D7" w:val="clear"/>
         </w:rPr>
-        <w:t xml:space="preserve">[Summary]</w:t>
-      </w:r>
-      <w:r>
-        <w:rPr>
-          <w:rFonts w:ascii="Calibri" w:cs="Calibri" w:eastAsia="Calibri" w:hAnsi="Calibri"/>
-        </w:rPr>
-        <w:t xml:space="preserve"> (fill this in Word)</w:t>
-      </w:r>
-    </w:p>
-    <w:p>
-      <w:pPr>
-        <w:pStyle w:val="ListParagraph"/>
-        <w:numPr>
-          <w:ilvl w:val="0"/>
-          <w:numId w:val="2"/>
-        </w:numPr>
-        <w:spacing w:after="60" w:line="276"/>
-      </w:pPr>
-      <w:r>
-        <w:rPr>
-          <w:rFonts w:ascii="Calibri" w:cs="Calibri" w:eastAsia="Calibri" w:hAnsi="Calibri"/>
-        </w:rPr>
-        <w:t xml:space="preserve">☐ Make it yours: Section 1, Purpose (generic text: add your details)</w:t>
-      </w:r>
-    </w:p>
-    <w:p>
-      <w:pPr>
-        <w:pStyle w:val="ListParagraph"/>
-        <w:numPr>
-          <w:ilvl w:val="0"/>
-          <w:numId w:val="2"/>
-        </w:numPr>
-        <w:spacing w:after="60" w:line="276"/>
-      </w:pPr>
-      <w:r>
-        <w:rPr>
-          <w:rFonts w:ascii="Calibri" w:cs="Calibri" w:eastAsia="Calibri" w:hAnsi="Calibri"/>
-        </w:rPr>
-        <w:t xml:space="preserve">☐ Make it yours: Section 2, Scope (generic text: add your details)</w:t>
-      </w:r>
-    </w:p>
-    <w:p>
-      <w:pPr>
-        <w:pStyle w:val="ListParagraph"/>
-        <w:numPr>
-          <w:ilvl w:val="0"/>
-          <w:numId w:val="2"/>
-        </w:numPr>
-        <w:spacing w:after="60" w:line="276"/>
-      </w:pPr>
-      <w:r>
-        <w:rPr>
-          <w:rFonts w:ascii="Calibri" w:cs="Calibri" w:eastAsia="Calibri" w:hAnsi="Calibri"/>
-        </w:rPr>
-        <w:t xml:space="preserve">☐ Make it yours: Section 4, Policy statement (generic text: add your details)</w:t>
-      </w:r>
-    </w:p>
-    <w:p>
-      <w:pPr>
-        <w:pStyle w:val="ListParagraph"/>
-        <w:numPr>
-          <w:ilvl w:val="0"/>
-          <w:numId w:val="2"/>
-        </w:numPr>
-        <w:spacing w:after="60" w:line="276"/>
-      </w:pPr>
-      <w:r>
-        <w:rPr>
-          <w:rFonts w:ascii="Calibri" w:cs="Calibri" w:eastAsia="Calibri" w:hAnsi="Calibri"/>
-        </w:rPr>
-        <w:t xml:space="preserve">☐ Make it yours: Section 5, How we put this into practice (generic text: add your details)</w:t>
-      </w:r>
-    </w:p>
-    <w:p>
-      <w:pPr>
-        <w:pStyle w:val="ListParagraph"/>
-        <w:numPr>
-          <w:ilvl w:val="0"/>
-          <w:numId w:val="2"/>
-        </w:numPr>
-        <w:spacing w:after="60" w:line="276"/>
-      </w:pPr>
-      <w:r>
-        <w:rPr>
-          <w:rFonts w:ascii="Calibri" w:cs="Calibri" w:eastAsia="Calibri" w:hAnsi="Calibri"/>
-        </w:rPr>
-        <w:t xml:space="preserve">☐ Make it yours: Section 6, Responsibilities (generic text: add your details)</w:t>
-      </w:r>
-    </w:p>
-    <w:p>
-      <w:pPr>
-        <w:pStyle w:val="ListParagraph"/>
-        <w:numPr>
-          <w:ilvl w:val="0"/>
-          <w:numId w:val="2"/>
-        </w:numPr>
-        <w:spacing w:after="60" w:line="276"/>
-      </w:pPr>
-      <w:r>
-        <w:rPr>
-          <w:rFonts w:ascii="Calibri" w:cs="Calibri" w:eastAsia="Calibri" w:hAnsi="Calibri"/>
-        </w:rPr>
-        <w:t xml:space="preserve">☐ Make it yours: Section 7, Complaints procedure (generic text: add your details)</w:t>
-      </w:r>
-    </w:p>
-    <w:p>
-      <w:pPr>
-        <w:pStyle w:val="ListParagraph"/>
-        <w:numPr>
-          <w:ilvl w:val="0"/>
-          <w:numId w:val="2"/>
-        </w:numPr>
-        <w:spacing w:after="60" w:line="276"/>
-      </w:pPr>
-      <w:r>
-        <w:rPr>
-          <w:rFonts w:ascii="Calibri" w:cs="Calibri" w:eastAsia="Calibri" w:hAnsi="Calibri"/>
-        </w:rPr>
-        <w:t xml:space="preserve">Read once: fixed text in sections 3, 8 to 11.</w:t>
-      </w:r>
-    </w:p>
-    <w:p>
-      <w:pPr>
-        <w:pStyle w:val="ListParagraph"/>
-        <w:numPr>
-          <w:ilvl w:val="0"/>
-          <w:numId w:val="2"/>
-        </w:numPr>
-        <w:spacing w:after="60" w:line="276"/>
-      </w:pPr>
-      <w:r>
-        <w:rPr>
-          <w:rFonts w:ascii="Calibri" w:cs="Calibri" w:eastAsia="Calibri" w:hAnsi="Calibri"/>
-        </w:rPr>
-        <w:t xml:space="preserve">☐ Adopt: sign and date the document control table, then mark it adopted on your documents page.</w:t>
-      </w:r>
-    </w:p>
-    <w:p>
-      <w:pPr>
-        <w:spacing w:after="120" w:line="276"/>
-      </w:pPr>
-      <w:r>
-        <w:rPr>
-          <w:rFonts w:ascii="Calibri" w:cs="Calibri" w:eastAsia="Calibri" w:hAnsi="Calibri"/>
-        </w:rPr>
-        <w:t xml:space="preserve">8. Incident management policy, procedure and register (about 30 minutes; 1 to fill in, 0 to review)</w:t>
-      </w:r>
-    </w:p>
-    <w:p>
-      <w:pPr>
-        <w:pStyle w:val="ListParagraph"/>
-        <w:numPr>
-          <w:ilvl w:val="0"/>
-          <w:numId w:val="2"/>
-        </w:numPr>
-        <w:spacing w:after="60" w:line="276"/>
-      </w:pPr>
-      <w:r>
-        <w:rPr>
-          <w:rFonts w:ascii="Calibri" w:cs="Calibri" w:eastAsia="Calibri" w:hAnsi="Calibri"/>
-        </w:rPr>
-        <w:t xml:space="preserve">Open: incident-management-policy-and-register.docx</w:t>
-      </w:r>
-    </w:p>
-    <w:p>
-      <w:pPr>
-        <w:pStyle w:val="ListParagraph"/>
-        <w:numPr>
-          <w:ilvl w:val="0"/>
-          <w:numId w:val="2"/>
-        </w:numPr>
-        <w:spacing w:after="60" w:line="276"/>
-      </w:pPr>
-      <w:r>
-        <w:rPr>
-          <w:rFonts w:ascii="Calibri" w:cs="Calibri" w:eastAsia="Calibri" w:hAnsi="Calibri"/>
-        </w:rPr>
-        <w:t xml:space="preserve">☐ Fill in: Section 9, Incident register: </w:t>
+        <w:t xml:space="preserve">[Action and outcome]</w:t>
+      </w:r>
+    </w:p>
+    <w:p>
+      <w:pPr>
+        <w:pStyle w:val="ListParagraph"/>
+        <w:numPr>
+          <w:ilvl w:val="0"/>
+          <w:numId w:val="2"/>
+        </w:numPr>
+        <w:spacing w:after="60" w:line="276"/>
+      </w:pPr>
+      <w:r>
+        <w:rPr>
+          <w:rFonts w:ascii="Calibri" w:cs="Calibri" w:eastAsia="Calibri" w:hAnsi="Calibri"/>
+        </w:rPr>
+        <w:t xml:space="preserve">☐ Fill in Word: Section 9, Incident register: </w:t>
       </w:r>
       <w:r>
         <w:rPr>
@@ -2040,7 +2034,13 @@
           <w:szCs w:val="24"/>
           <w:shd w:fill="FBE9D7" w:val="clear"/>
         </w:rPr>
-        <w:t xml:space="preserve">[Action and outcome]</w:t>
+        <w:t xml:space="preserve">[Code]</w:t>
+      </w:r>
+      <w:r>
+        <w:rPr>
+          <w:rFonts w:ascii="Calibri" w:cs="Calibri" w:eastAsia="Calibri" w:hAnsi="Calibri"/>
+        </w:rPr>
+        <w:t xml:space="preserve"> (fill this in Word)</w:t>
       </w:r>
     </w:p>
     <w:p>
@@ -2065,7 +2065,7 @@
           <w:szCs w:val="24"/>
           <w:shd w:fill="FBE9D7" w:val="clear"/>
         </w:rPr>
-        <w:t xml:space="preserve">[Code]</w:t>
+        <w:t xml:space="preserve">[Summary]</w:t>
       </w:r>
       <w:r>
         <w:rPr>
@@ -2087,7 +2087,301 @@
         <w:rPr>
           <w:rFonts w:ascii="Calibri" w:cs="Calibri" w:eastAsia="Calibri" w:hAnsi="Calibri"/>
         </w:rPr>
-        <w:t xml:space="preserve">☐ Fill in Word: Section 9, Incident register: </w:t>
+        <w:t xml:space="preserve">☐ Make it yours: Section 1, Purpose (generic text: add your details)</w:t>
+      </w:r>
+    </w:p>
+    <w:p>
+      <w:pPr>
+        <w:pStyle w:val="ListParagraph"/>
+        <w:numPr>
+          <w:ilvl w:val="0"/>
+          <w:numId w:val="2"/>
+        </w:numPr>
+        <w:spacing w:after="60" w:line="276"/>
+      </w:pPr>
+      <w:r>
+        <w:rPr>
+          <w:rFonts w:ascii="Calibri" w:cs="Calibri" w:eastAsia="Calibri" w:hAnsi="Calibri"/>
+        </w:rPr>
+        <w:t xml:space="preserve">☐ Make it yours: Section 2, Scope (generic text: add your details)</w:t>
+      </w:r>
+    </w:p>
+    <w:p>
+      <w:pPr>
+        <w:pStyle w:val="ListParagraph"/>
+        <w:numPr>
+          <w:ilvl w:val="0"/>
+          <w:numId w:val="2"/>
+        </w:numPr>
+        <w:spacing w:after="60" w:line="276"/>
+      </w:pPr>
+      <w:r>
+        <w:rPr>
+          <w:rFonts w:ascii="Calibri" w:cs="Calibri" w:eastAsia="Calibri" w:hAnsi="Calibri"/>
+        </w:rPr>
+        <w:t xml:space="preserve">☐ Make it yours: Section 4, Policy statement (generic text: add your details)</w:t>
+      </w:r>
+    </w:p>
+    <w:p>
+      <w:pPr>
+        <w:pStyle w:val="ListParagraph"/>
+        <w:numPr>
+          <w:ilvl w:val="0"/>
+          <w:numId w:val="2"/>
+        </w:numPr>
+        <w:spacing w:after="60" w:line="276"/>
+      </w:pPr>
+      <w:r>
+        <w:rPr>
+          <w:rFonts w:ascii="Calibri" w:cs="Calibri" w:eastAsia="Calibri" w:hAnsi="Calibri"/>
+        </w:rPr>
+        <w:t xml:space="preserve">☐ Make it yours: Section 5, How we put this into practice (generic text: add your details)</w:t>
+      </w:r>
+    </w:p>
+    <w:p>
+      <w:pPr>
+        <w:pStyle w:val="ListParagraph"/>
+        <w:numPr>
+          <w:ilvl w:val="0"/>
+          <w:numId w:val="2"/>
+        </w:numPr>
+        <w:spacing w:after="60" w:line="276"/>
+      </w:pPr>
+      <w:r>
+        <w:rPr>
+          <w:rFonts w:ascii="Calibri" w:cs="Calibri" w:eastAsia="Calibri" w:hAnsi="Calibri"/>
+        </w:rPr>
+        <w:t xml:space="preserve">☐ Make it yours: Section 6, Responsibilities (generic text: add your details)</w:t>
+      </w:r>
+    </w:p>
+    <w:p>
+      <w:pPr>
+        <w:pStyle w:val="ListParagraph"/>
+        <w:numPr>
+          <w:ilvl w:val="0"/>
+          <w:numId w:val="2"/>
+        </w:numPr>
+        <w:spacing w:after="60" w:line="276"/>
+      </w:pPr>
+      <w:r>
+        <w:rPr>
+          <w:rFonts w:ascii="Calibri" w:cs="Calibri" w:eastAsia="Calibri" w:hAnsi="Calibri"/>
+        </w:rPr>
+        <w:t xml:space="preserve">☐ Make it yours: Section 8, Incident procedure (generic text: add your details)</w:t>
+      </w:r>
+    </w:p>
+    <w:p>
+      <w:pPr>
+        <w:pStyle w:val="ListParagraph"/>
+        <w:numPr>
+          <w:ilvl w:val="0"/>
+          <w:numId w:val="2"/>
+        </w:numPr>
+        <w:spacing w:after="60" w:line="276"/>
+      </w:pPr>
+      <w:r>
+        <w:rPr>
+          <w:rFonts w:ascii="Calibri" w:cs="Calibri" w:eastAsia="Calibri" w:hAnsi="Calibri"/>
+        </w:rPr>
+        <w:t xml:space="preserve">Read once: fixed text in sections 3, 7, 9 to 12.</w:t>
+      </w:r>
+    </w:p>
+    <w:p>
+      <w:pPr>
+        <w:pStyle w:val="ListParagraph"/>
+        <w:numPr>
+          <w:ilvl w:val="0"/>
+          <w:numId w:val="2"/>
+        </w:numPr>
+        <w:spacing w:after="60" w:line="276"/>
+      </w:pPr>
+      <w:r>
+        <w:rPr>
+          <w:rFonts w:ascii="Calibri" w:cs="Calibri" w:eastAsia="Calibri" w:hAnsi="Calibri"/>
+        </w:rPr>
+        <w:t xml:space="preserve">☐ Adopt: sign and date the document control table, then mark it adopted on your documents page.</w:t>
+      </w:r>
+    </w:p>
+    <w:p>
+      <w:pPr>
+        <w:spacing w:after="120" w:line="276"/>
+      </w:pPr>
+      <w:r>
+        <w:rPr>
+          <w:rFonts w:ascii="Calibri" w:cs="Calibri" w:eastAsia="Calibri" w:hAnsi="Calibri"/>
+        </w:rPr>
+        <w:t xml:space="preserve">9. Emergency and disaster management plan (about 25 minutes; 0 to fill in, 0 to review)</w:t>
+      </w:r>
+    </w:p>
+    <w:p>
+      <w:pPr>
+        <w:pStyle w:val="ListParagraph"/>
+        <w:numPr>
+          <w:ilvl w:val="0"/>
+          <w:numId w:val="2"/>
+        </w:numPr>
+        <w:spacing w:after="60" w:line="276"/>
+      </w:pPr>
+      <w:r>
+        <w:rPr>
+          <w:rFonts w:ascii="Calibri" w:cs="Calibri" w:eastAsia="Calibri" w:hAnsi="Calibri"/>
+        </w:rPr>
+        <w:t xml:space="preserve">Open: emergency-and-disaster-management-plan.docx</w:t>
+      </w:r>
+    </w:p>
+    <w:p>
+      <w:pPr>
+        <w:pStyle w:val="ListParagraph"/>
+        <w:numPr>
+          <w:ilvl w:val="0"/>
+          <w:numId w:val="2"/>
+        </w:numPr>
+        <w:spacing w:after="60" w:line="276"/>
+      </w:pPr>
+      <w:r>
+        <w:rPr>
+          <w:rFonts w:ascii="Calibri" w:cs="Calibri" w:eastAsia="Calibri" w:hAnsi="Calibri"/>
+        </w:rPr>
+        <w:t xml:space="preserve">☐ Make it yours: Section 1, Purpose (generic text: add your details)</w:t>
+      </w:r>
+    </w:p>
+    <w:p>
+      <w:pPr>
+        <w:pStyle w:val="ListParagraph"/>
+        <w:numPr>
+          <w:ilvl w:val="0"/>
+          <w:numId w:val="2"/>
+        </w:numPr>
+        <w:spacing w:after="60" w:line="276"/>
+      </w:pPr>
+      <w:r>
+        <w:rPr>
+          <w:rFonts w:ascii="Calibri" w:cs="Calibri" w:eastAsia="Calibri" w:hAnsi="Calibri"/>
+        </w:rPr>
+        <w:t xml:space="preserve">☐ Make it yours: Section 2, Our services and where we deliver them (generic text: add your details)</w:t>
+      </w:r>
+    </w:p>
+    <w:p>
+      <w:pPr>
+        <w:pStyle w:val="ListParagraph"/>
+        <w:numPr>
+          <w:ilvl w:val="0"/>
+          <w:numId w:val="2"/>
+        </w:numPr>
+        <w:spacing w:after="60" w:line="276"/>
+      </w:pPr>
+      <w:r>
+        <w:rPr>
+          <w:rFonts w:ascii="Calibri" w:cs="Calibri" w:eastAsia="Calibri" w:hAnsi="Calibri"/>
+        </w:rPr>
+        <w:t xml:space="preserve">☐ Make it yours: Section 3, Scenarios we plan for (generic text: add your details)</w:t>
+      </w:r>
+    </w:p>
+    <w:p>
+      <w:pPr>
+        <w:pStyle w:val="ListParagraph"/>
+        <w:numPr>
+          <w:ilvl w:val="0"/>
+          <w:numId w:val="2"/>
+        </w:numPr>
+        <w:spacing w:after="60" w:line="276"/>
+      </w:pPr>
+      <w:r>
+        <w:rPr>
+          <w:rFonts w:ascii="Calibri" w:cs="Calibri" w:eastAsia="Calibri" w:hAnsi="Calibri"/>
+        </w:rPr>
+        <w:t xml:space="preserve">☐ Make it yours: Section 4, What we will do (generic text: add your details)</w:t>
+      </w:r>
+    </w:p>
+    <w:p>
+      <w:pPr>
+        <w:pStyle w:val="ListParagraph"/>
+        <w:numPr>
+          <w:ilvl w:val="0"/>
+          <w:numId w:val="2"/>
+        </w:numPr>
+        <w:spacing w:after="60" w:line="276"/>
+      </w:pPr>
+      <w:r>
+        <w:rPr>
+          <w:rFonts w:ascii="Calibri" w:cs="Calibri" w:eastAsia="Calibri" w:hAnsi="Calibri"/>
+        </w:rPr>
+        <w:t xml:space="preserve">☐ Make it yours: Section 5, Responsibilities (generic text: add your details)</w:t>
+      </w:r>
+    </w:p>
+    <w:p>
+      <w:pPr>
+        <w:pStyle w:val="ListParagraph"/>
+        <w:numPr>
+          <w:ilvl w:val="0"/>
+          <w:numId w:val="2"/>
+        </w:numPr>
+        <w:spacing w:after="60" w:line="276"/>
+      </w:pPr>
+      <w:r>
+        <w:rPr>
+          <w:rFonts w:ascii="Calibri" w:cs="Calibri" w:eastAsia="Calibri" w:hAnsi="Calibri"/>
+        </w:rPr>
+        <w:t xml:space="preserve">Read once: fixed text in sections 6 to 8.</w:t>
+      </w:r>
+    </w:p>
+    <w:p>
+      <w:pPr>
+        <w:pStyle w:val="ListParagraph"/>
+        <w:numPr>
+          <w:ilvl w:val="0"/>
+          <w:numId w:val="2"/>
+        </w:numPr>
+        <w:spacing w:after="60" w:line="276"/>
+      </w:pPr>
+      <w:r>
+        <w:rPr>
+          <w:rFonts w:ascii="Calibri" w:cs="Calibri" w:eastAsia="Calibri" w:hAnsi="Calibri"/>
+        </w:rPr>
+        <w:t xml:space="preserve">☐ Adopt: sign and date the document control table, then mark it adopted on your documents page.</w:t>
+      </w:r>
+    </w:p>
+    <w:p>
+      <w:pPr>
+        <w:spacing w:after="120" w:line="276"/>
+      </w:pPr>
+      <w:r>
+        <w:rPr>
+          <w:rFonts w:ascii="Calibri" w:cs="Calibri" w:eastAsia="Calibri" w:hAnsi="Calibri"/>
+        </w:rPr>
+        <w:t xml:space="preserve">10. Worker screening and recruitment procedure (about 25 minutes; 0 to fill in, 0 to review)</w:t>
+      </w:r>
+    </w:p>
+    <w:p>
+      <w:pPr>
+        <w:pStyle w:val="ListParagraph"/>
+        <w:numPr>
+          <w:ilvl w:val="0"/>
+          <w:numId w:val="2"/>
+        </w:numPr>
+        <w:spacing w:after="60" w:line="276"/>
+      </w:pPr>
+      <w:r>
+        <w:rPr>
+          <w:rFonts w:ascii="Calibri" w:cs="Calibri" w:eastAsia="Calibri" w:hAnsi="Calibri"/>
+        </w:rPr>
+        <w:t xml:space="preserve">Open: worker-screening-and-recruitment-procedure.docx</w:t>
+      </w:r>
+    </w:p>
+    <w:p>
+      <w:pPr>
+        <w:pStyle w:val="ListParagraph"/>
+        <w:numPr>
+          <w:ilvl w:val="0"/>
+          <w:numId w:val="2"/>
+        </w:numPr>
+        <w:spacing w:after="60" w:line="276"/>
+      </w:pPr>
+      <w:r>
+        <w:rPr>
+          <w:rFonts w:ascii="Calibri" w:cs="Calibri" w:eastAsia="Calibri" w:hAnsi="Calibri"/>
+        </w:rPr>
+        <w:t xml:space="preserve">☐ Fill in Word: Section 6, Worker screening clearance register: </w:t>
       </w:r>
       <w:r>
         <w:rPr>
@@ -2096,307 +2390,13 @@
           <w:szCs w:val="24"/>
           <w:shd w:fill="FBE9D7" w:val="clear"/>
         </w:rPr>
-        <w:t xml:space="preserve">[Summary]</w:t>
+        <w:t xml:space="preserve">[NDIS worker screening clearance]</w:t>
       </w:r>
       <w:r>
         <w:rPr>
           <w:rFonts w:ascii="Calibri" w:cs="Calibri" w:eastAsia="Calibri" w:hAnsi="Calibri"/>
         </w:rPr>
         <w:t xml:space="preserve"> (fill this in Word)</w:t>
-      </w:r>
-    </w:p>
-    <w:p>
-      <w:pPr>
-        <w:pStyle w:val="ListParagraph"/>
-        <w:numPr>
-          <w:ilvl w:val="0"/>
-          <w:numId w:val="2"/>
-        </w:numPr>
-        <w:spacing w:after="60" w:line="276"/>
-      </w:pPr>
-      <w:r>
-        <w:rPr>
-          <w:rFonts w:ascii="Calibri" w:cs="Calibri" w:eastAsia="Calibri" w:hAnsi="Calibri"/>
-        </w:rPr>
-        <w:t xml:space="preserve">☐ Make it yours: Section 1, Purpose (generic text: add your details)</w:t>
-      </w:r>
-    </w:p>
-    <w:p>
-      <w:pPr>
-        <w:pStyle w:val="ListParagraph"/>
-        <w:numPr>
-          <w:ilvl w:val="0"/>
-          <w:numId w:val="2"/>
-        </w:numPr>
-        <w:spacing w:after="60" w:line="276"/>
-      </w:pPr>
-      <w:r>
-        <w:rPr>
-          <w:rFonts w:ascii="Calibri" w:cs="Calibri" w:eastAsia="Calibri" w:hAnsi="Calibri"/>
-        </w:rPr>
-        <w:t xml:space="preserve">☐ Make it yours: Section 2, Scope (generic text: add your details)</w:t>
-      </w:r>
-    </w:p>
-    <w:p>
-      <w:pPr>
-        <w:pStyle w:val="ListParagraph"/>
-        <w:numPr>
-          <w:ilvl w:val="0"/>
-          <w:numId w:val="2"/>
-        </w:numPr>
-        <w:spacing w:after="60" w:line="276"/>
-      </w:pPr>
-      <w:r>
-        <w:rPr>
-          <w:rFonts w:ascii="Calibri" w:cs="Calibri" w:eastAsia="Calibri" w:hAnsi="Calibri"/>
-        </w:rPr>
-        <w:t xml:space="preserve">☐ Make it yours: Section 4, Policy statement (generic text: add your details)</w:t>
-      </w:r>
-    </w:p>
-    <w:p>
-      <w:pPr>
-        <w:pStyle w:val="ListParagraph"/>
-        <w:numPr>
-          <w:ilvl w:val="0"/>
-          <w:numId w:val="2"/>
-        </w:numPr>
-        <w:spacing w:after="60" w:line="276"/>
-      </w:pPr>
-      <w:r>
-        <w:rPr>
-          <w:rFonts w:ascii="Calibri" w:cs="Calibri" w:eastAsia="Calibri" w:hAnsi="Calibri"/>
-        </w:rPr>
-        <w:t xml:space="preserve">☐ Make it yours: Section 5, How we put this into practice (generic text: add your details)</w:t>
-      </w:r>
-    </w:p>
-    <w:p>
-      <w:pPr>
-        <w:pStyle w:val="ListParagraph"/>
-        <w:numPr>
-          <w:ilvl w:val="0"/>
-          <w:numId w:val="2"/>
-        </w:numPr>
-        <w:spacing w:after="60" w:line="276"/>
-      </w:pPr>
-      <w:r>
-        <w:rPr>
-          <w:rFonts w:ascii="Calibri" w:cs="Calibri" w:eastAsia="Calibri" w:hAnsi="Calibri"/>
-        </w:rPr>
-        <w:t xml:space="preserve">☐ Make it yours: Section 6, Responsibilities (generic text: add your details)</w:t>
-      </w:r>
-    </w:p>
-    <w:p>
-      <w:pPr>
-        <w:pStyle w:val="ListParagraph"/>
-        <w:numPr>
-          <w:ilvl w:val="0"/>
-          <w:numId w:val="2"/>
-        </w:numPr>
-        <w:spacing w:after="60" w:line="276"/>
-      </w:pPr>
-      <w:r>
-        <w:rPr>
-          <w:rFonts w:ascii="Calibri" w:cs="Calibri" w:eastAsia="Calibri" w:hAnsi="Calibri"/>
-        </w:rPr>
-        <w:t xml:space="preserve">☐ Make it yours: Section 8, Incident procedure (generic text: add your details)</w:t>
-      </w:r>
-    </w:p>
-    <w:p>
-      <w:pPr>
-        <w:pStyle w:val="ListParagraph"/>
-        <w:numPr>
-          <w:ilvl w:val="0"/>
-          <w:numId w:val="2"/>
-        </w:numPr>
-        <w:spacing w:after="60" w:line="276"/>
-      </w:pPr>
-      <w:r>
-        <w:rPr>
-          <w:rFonts w:ascii="Calibri" w:cs="Calibri" w:eastAsia="Calibri" w:hAnsi="Calibri"/>
-        </w:rPr>
-        <w:t xml:space="preserve">Read once: fixed text in sections 3, 7, 9 to 12.</w:t>
-      </w:r>
-    </w:p>
-    <w:p>
-      <w:pPr>
-        <w:pStyle w:val="ListParagraph"/>
-        <w:numPr>
-          <w:ilvl w:val="0"/>
-          <w:numId w:val="2"/>
-        </w:numPr>
-        <w:spacing w:after="60" w:line="276"/>
-      </w:pPr>
-      <w:r>
-        <w:rPr>
-          <w:rFonts w:ascii="Calibri" w:cs="Calibri" w:eastAsia="Calibri" w:hAnsi="Calibri"/>
-        </w:rPr>
-        <w:t xml:space="preserve">☐ Adopt: sign and date the document control table, then mark it adopted on your documents page.</w:t>
-      </w:r>
-    </w:p>
-    <w:p>
-      <w:pPr>
-        <w:spacing w:after="120" w:line="276"/>
-      </w:pPr>
-      <w:r>
-        <w:rPr>
-          <w:rFonts w:ascii="Calibri" w:cs="Calibri" w:eastAsia="Calibri" w:hAnsi="Calibri"/>
-        </w:rPr>
-        <w:t xml:space="preserve">9. Emergency and disaster management plan (about 25 minutes; 0 to fill in, 0 to review)</w:t>
-      </w:r>
-    </w:p>
-    <w:p>
-      <w:pPr>
-        <w:pStyle w:val="ListParagraph"/>
-        <w:numPr>
-          <w:ilvl w:val="0"/>
-          <w:numId w:val="2"/>
-        </w:numPr>
-        <w:spacing w:after="60" w:line="276"/>
-      </w:pPr>
-      <w:r>
-        <w:rPr>
-          <w:rFonts w:ascii="Calibri" w:cs="Calibri" w:eastAsia="Calibri" w:hAnsi="Calibri"/>
-        </w:rPr>
-        <w:t xml:space="preserve">Open: emergency-and-disaster-management-plan.docx</w:t>
-      </w:r>
-    </w:p>
-    <w:p>
-      <w:pPr>
-        <w:pStyle w:val="ListParagraph"/>
-        <w:numPr>
-          <w:ilvl w:val="0"/>
-          <w:numId w:val="2"/>
-        </w:numPr>
-        <w:spacing w:after="60" w:line="276"/>
-      </w:pPr>
-      <w:r>
-        <w:rPr>
-          <w:rFonts w:ascii="Calibri" w:cs="Calibri" w:eastAsia="Calibri" w:hAnsi="Calibri"/>
-        </w:rPr>
-        <w:t xml:space="preserve">☐ Make it yours: Section 1, Purpose (generic text: add your details)</w:t>
-      </w:r>
-    </w:p>
-    <w:p>
-      <w:pPr>
-        <w:pStyle w:val="ListParagraph"/>
-        <w:numPr>
-          <w:ilvl w:val="0"/>
-          <w:numId w:val="2"/>
-        </w:numPr>
-        <w:spacing w:after="60" w:line="276"/>
-      </w:pPr>
-      <w:r>
-        <w:rPr>
-          <w:rFonts w:ascii="Calibri" w:cs="Calibri" w:eastAsia="Calibri" w:hAnsi="Calibri"/>
-        </w:rPr>
-        <w:t xml:space="preserve">☐ Make it yours: Section 2, Our services and where we deliver them (generic text: add your details)</w:t>
-      </w:r>
-    </w:p>
-    <w:p>
-      <w:pPr>
-        <w:pStyle w:val="ListParagraph"/>
-        <w:numPr>
-          <w:ilvl w:val="0"/>
-          <w:numId w:val="2"/>
-        </w:numPr>
-        <w:spacing w:after="60" w:line="276"/>
-      </w:pPr>
-      <w:r>
-        <w:rPr>
-          <w:rFonts w:ascii="Calibri" w:cs="Calibri" w:eastAsia="Calibri" w:hAnsi="Calibri"/>
-        </w:rPr>
-        <w:t xml:space="preserve">☐ Make it yours: Section 3, Scenarios we plan for (generic text: add your details)</w:t>
-      </w:r>
-    </w:p>
-    <w:p>
-      <w:pPr>
-        <w:pStyle w:val="ListParagraph"/>
-        <w:numPr>
-          <w:ilvl w:val="0"/>
-          <w:numId w:val="2"/>
-        </w:numPr>
-        <w:spacing w:after="60" w:line="276"/>
-      </w:pPr>
-      <w:r>
-        <w:rPr>
-          <w:rFonts w:ascii="Calibri" w:cs="Calibri" w:eastAsia="Calibri" w:hAnsi="Calibri"/>
-        </w:rPr>
-        <w:t xml:space="preserve">☐ Make it yours: Section 4, What we will do (generic text: add your details)</w:t>
-      </w:r>
-    </w:p>
-    <w:p>
-      <w:pPr>
-        <w:pStyle w:val="ListParagraph"/>
-        <w:numPr>
-          <w:ilvl w:val="0"/>
-          <w:numId w:val="2"/>
-        </w:numPr>
-        <w:spacing w:after="60" w:line="276"/>
-      </w:pPr>
-      <w:r>
-        <w:rPr>
-          <w:rFonts w:ascii="Calibri" w:cs="Calibri" w:eastAsia="Calibri" w:hAnsi="Calibri"/>
-        </w:rPr>
-        <w:t xml:space="preserve">☐ Make it yours: Section 5, Responsibilities (generic text: add your details)</w:t>
-      </w:r>
-    </w:p>
-    <w:p>
-      <w:pPr>
-        <w:pStyle w:val="ListParagraph"/>
-        <w:numPr>
-          <w:ilvl w:val="0"/>
-          <w:numId w:val="2"/>
-        </w:numPr>
-        <w:spacing w:after="60" w:line="276"/>
-      </w:pPr>
-      <w:r>
-        <w:rPr>
-          <w:rFonts w:ascii="Calibri" w:cs="Calibri" w:eastAsia="Calibri" w:hAnsi="Calibri"/>
-        </w:rPr>
-        <w:t xml:space="preserve">Read once: fixed text in sections 6 to 8.</w:t>
-      </w:r>
-    </w:p>
-    <w:p>
-      <w:pPr>
-        <w:pStyle w:val="ListParagraph"/>
-        <w:numPr>
-          <w:ilvl w:val="0"/>
-          <w:numId w:val="2"/>
-        </w:numPr>
-        <w:spacing w:after="60" w:line="276"/>
-      </w:pPr>
-      <w:r>
-        <w:rPr>
-          <w:rFonts w:ascii="Calibri" w:cs="Calibri" w:eastAsia="Calibri" w:hAnsi="Calibri"/>
-        </w:rPr>
-        <w:t xml:space="preserve">☐ Adopt: sign and date the document control table, then mark it adopted on your documents page.</w:t>
-      </w:r>
-    </w:p>
-    <w:p>
-      <w:pPr>
-        <w:spacing w:after="120" w:line="276"/>
-      </w:pPr>
-      <w:r>
-        <w:rPr>
-          <w:rFonts w:ascii="Calibri" w:cs="Calibri" w:eastAsia="Calibri" w:hAnsi="Calibri"/>
-        </w:rPr>
-        <w:t xml:space="preserve">10. Worker screening and recruitment procedure (about 25 minutes; 0 to fill in, 0 to review)</w:t>
-      </w:r>
-    </w:p>
-    <w:p>
-      <w:pPr>
-        <w:pStyle w:val="ListParagraph"/>
-        <w:numPr>
-          <w:ilvl w:val="0"/>
-          <w:numId w:val="2"/>
-        </w:numPr>
-        <w:spacing w:after="60" w:line="276"/>
-      </w:pPr>
-      <w:r>
-        <w:rPr>
-          <w:rFonts w:ascii="Calibri" w:cs="Calibri" w:eastAsia="Calibri" w:hAnsi="Calibri"/>
-        </w:rPr>
-        <w:t xml:space="preserve">Open: worker-screening-and-recruitment-procedure.docx</w:t>
       </w:r>
     </w:p>
     <w:p>
@@ -2421,7 +2421,7 @@
           <w:szCs w:val="24"/>
           <w:shd w:fill="FBE9D7" w:val="clear"/>
         </w:rPr>
-        <w:t xml:space="preserve">[NDIS worker screening clearance]</w:t>
+        <w:t xml:space="preserve">[Number]</w:t>
       </w:r>
       <w:r>
         <w:rPr>
@@ -2443,7 +2443,146 @@
         <w:rPr>
           <w:rFonts w:ascii="Calibri" w:cs="Calibri" w:eastAsia="Calibri" w:hAnsi="Calibri"/>
         </w:rPr>
-        <w:t xml:space="preserve">☐ Fill in Word: Section 6, Worker screening clearance register: </w:t>
+        <w:t xml:space="preserve">☐ Make it yours: Section 1, Purpose (generic text: add your details)</w:t>
+      </w:r>
+    </w:p>
+    <w:p>
+      <w:pPr>
+        <w:pStyle w:val="ListParagraph"/>
+        <w:numPr>
+          <w:ilvl w:val="0"/>
+          <w:numId w:val="2"/>
+        </w:numPr>
+        <w:spacing w:after="60" w:line="276"/>
+      </w:pPr>
+      <w:r>
+        <w:rPr>
+          <w:rFonts w:ascii="Calibri" w:cs="Calibri" w:eastAsia="Calibri" w:hAnsi="Calibri"/>
+        </w:rPr>
+        <w:t xml:space="preserve">☐ Make it yours: Section 2, When this procedure applies (generic text: add your details)</w:t>
+      </w:r>
+    </w:p>
+    <w:p>
+      <w:pPr>
+        <w:pStyle w:val="ListParagraph"/>
+        <w:numPr>
+          <w:ilvl w:val="0"/>
+          <w:numId w:val="2"/>
+        </w:numPr>
+        <w:spacing w:after="60" w:line="276"/>
+      </w:pPr>
+      <w:r>
+        <w:rPr>
+          <w:rFonts w:ascii="Calibri" w:cs="Calibri" w:eastAsia="Calibri" w:hAnsi="Calibri"/>
+        </w:rPr>
+        <w:t xml:space="preserve">☐ Make it yours: Section 3, Steps (generic text: add your details)</w:t>
+      </w:r>
+    </w:p>
+    <w:p>
+      <w:pPr>
+        <w:pStyle w:val="ListParagraph"/>
+        <w:numPr>
+          <w:ilvl w:val="0"/>
+          <w:numId w:val="2"/>
+        </w:numPr>
+        <w:spacing w:after="60" w:line="276"/>
+      </w:pPr>
+      <w:r>
+        <w:rPr>
+          <w:rFonts w:ascii="Calibri" w:cs="Calibri" w:eastAsia="Calibri" w:hAnsi="Calibri"/>
+        </w:rPr>
+        <w:t xml:space="preserve">☐ Make it yours: Section 4, Responsibilities (generic text: add your details)</w:t>
+      </w:r>
+    </w:p>
+    <w:p>
+      <w:pPr>
+        <w:pStyle w:val="ListParagraph"/>
+        <w:numPr>
+          <w:ilvl w:val="0"/>
+          <w:numId w:val="2"/>
+        </w:numPr>
+        <w:spacing w:after="60" w:line="276"/>
+      </w:pPr>
+      <w:r>
+        <w:rPr>
+          <w:rFonts w:ascii="Calibri" w:cs="Calibri" w:eastAsia="Calibri" w:hAnsi="Calibri"/>
+        </w:rPr>
+        <w:t xml:space="preserve">☐ Make it yours: Section 5, Our risk-assessed roles (generic text: add your details)</w:t>
+      </w:r>
+    </w:p>
+    <w:p>
+      <w:pPr>
+        <w:pStyle w:val="ListParagraph"/>
+        <w:numPr>
+          <w:ilvl w:val="0"/>
+          <w:numId w:val="2"/>
+        </w:numPr>
+        <w:spacing w:after="60" w:line="276"/>
+      </w:pPr>
+      <w:r>
+        <w:rPr>
+          <w:rFonts w:ascii="Calibri" w:cs="Calibri" w:eastAsia="Calibri" w:hAnsi="Calibri"/>
+        </w:rPr>
+        <w:t xml:space="preserve">Read once: fixed text in sections 6 to 9.</w:t>
+      </w:r>
+    </w:p>
+    <w:p>
+      <w:pPr>
+        <w:pStyle w:val="ListParagraph"/>
+        <w:numPr>
+          <w:ilvl w:val="0"/>
+          <w:numId w:val="2"/>
+        </w:numPr>
+        <w:spacing w:after="60" w:line="276"/>
+      </w:pPr>
+      <w:r>
+        <w:rPr>
+          <w:rFonts w:ascii="Calibri" w:cs="Calibri" w:eastAsia="Calibri" w:hAnsi="Calibri"/>
+        </w:rPr>
+        <w:t xml:space="preserve">☐ Adopt: sign and date the document control table, then mark it adopted on your documents page.</w:t>
+      </w:r>
+    </w:p>
+    <w:p>
+      <w:pPr>
+        <w:spacing w:after="120" w:line="276"/>
+      </w:pPr>
+      <w:r>
+        <w:rPr>
+          <w:rFonts w:ascii="Calibri" w:cs="Calibri" w:eastAsia="Calibri" w:hAnsi="Calibri"/>
+        </w:rPr>
+        <w:t xml:space="preserve">11. Induction and training procedure and register (about 25 minutes; 0 to fill in, 0 to review)</w:t>
+      </w:r>
+    </w:p>
+    <w:p>
+      <w:pPr>
+        <w:pStyle w:val="ListParagraph"/>
+        <w:numPr>
+          <w:ilvl w:val="0"/>
+          <w:numId w:val="2"/>
+        </w:numPr>
+        <w:spacing w:after="60" w:line="276"/>
+      </w:pPr>
+      <w:r>
+        <w:rPr>
+          <w:rFonts w:ascii="Calibri" w:cs="Calibri" w:eastAsia="Calibri" w:hAnsi="Calibri"/>
+        </w:rPr>
+        <w:t xml:space="preserve">Open: induction-and-training-procedure-and-register.docx</w:t>
+      </w:r>
+    </w:p>
+    <w:p>
+      <w:pPr>
+        <w:pStyle w:val="ListParagraph"/>
+        <w:numPr>
+          <w:ilvl w:val="0"/>
+          <w:numId w:val="2"/>
+        </w:numPr>
+        <w:spacing w:after="60" w:line="276"/>
+      </w:pPr>
+      <w:r>
+        <w:rPr>
+          <w:rFonts w:ascii="Calibri" w:cs="Calibri" w:eastAsia="Calibri" w:hAnsi="Calibri"/>
+        </w:rPr>
+        <w:t xml:space="preserve">☐ Fill in Word: Section 6, Training register: </w:t>
       </w:r>
       <w:r>
         <w:rPr>
@@ -2452,7 +2591,7 @@
           <w:szCs w:val="24"/>
           <w:shd w:fill="FBE9D7" w:val="clear"/>
         </w:rPr>
-        <w:t xml:space="preserve">[Number]</w:t>
+        <w:t xml:space="preserve">[other training]</w:t>
       </w:r>
       <w:r>
         <w:rPr>
@@ -2538,7 +2677,7 @@
         <w:rPr>
           <w:rFonts w:ascii="Calibri" w:cs="Calibri" w:eastAsia="Calibri" w:hAnsi="Calibri"/>
         </w:rPr>
-        <w:t xml:space="preserve">☐ Make it yours: Section 5, Our risk-assessed roles (generic text: add your details)</w:t>
+        <w:t xml:space="preserve">☐ Make it yours: Section 5, Training we require (generic text: add your details)</w:t>
       </w:r>
     </w:p>
     <w:p>
@@ -2581,150 +2720,71 @@
         <w:rPr>
           <w:rFonts w:ascii="Calibri" w:cs="Calibri" w:eastAsia="Calibri" w:hAnsi="Calibri"/>
         </w:rPr>
-        <w:t xml:space="preserve">11. Induction and training procedure and register (about 25 minutes; 0 to fill in, 0 to review)</w:t>
-      </w:r>
-    </w:p>
-    <w:p>
-      <w:pPr>
-        <w:pStyle w:val="ListParagraph"/>
-        <w:numPr>
-          <w:ilvl w:val="0"/>
-          <w:numId w:val="2"/>
-        </w:numPr>
-        <w:spacing w:after="60" w:line="276"/>
-      </w:pPr>
-      <w:r>
-        <w:rPr>
-          <w:rFonts w:ascii="Calibri" w:cs="Calibri" w:eastAsia="Calibri" w:hAnsi="Calibri"/>
-        </w:rPr>
-        <w:t xml:space="preserve">Open: induction-and-training-procedure-and-register.docx</w:t>
-      </w:r>
-    </w:p>
-    <w:p>
-      <w:pPr>
-        <w:pStyle w:val="ListParagraph"/>
-        <w:numPr>
-          <w:ilvl w:val="0"/>
-          <w:numId w:val="2"/>
-        </w:numPr>
-        <w:spacing w:after="60" w:line="276"/>
-      </w:pPr>
-      <w:r>
-        <w:rPr>
-          <w:rFonts w:ascii="Calibri" w:cs="Calibri" w:eastAsia="Calibri" w:hAnsi="Calibri"/>
-        </w:rPr>
-        <w:t xml:space="preserve">☐ Fill in Word: Section 6, Training register: </w:t>
-      </w:r>
-      <w:r>
-        <w:rPr>
-          <w:rFonts w:ascii="Calibri" w:cs="Calibri" w:eastAsia="Calibri" w:hAnsi="Calibri"/>
-          <w:sz w:val="24"/>
-          <w:szCs w:val="24"/>
-          <w:shd w:fill="FBE9D7" w:val="clear"/>
-        </w:rPr>
-        <w:t xml:space="preserve">[other training]</w:t>
-      </w:r>
-      <w:r>
-        <w:rPr>
-          <w:rFonts w:ascii="Calibri" w:cs="Calibri" w:eastAsia="Calibri" w:hAnsi="Calibri"/>
-        </w:rPr>
-        <w:t xml:space="preserve"> (fill this in Word)</w:t>
-      </w:r>
-    </w:p>
-    <w:p>
-      <w:pPr>
-        <w:pStyle w:val="ListParagraph"/>
-        <w:numPr>
-          <w:ilvl w:val="0"/>
-          <w:numId w:val="2"/>
-        </w:numPr>
-        <w:spacing w:after="60" w:line="276"/>
-      </w:pPr>
-      <w:r>
-        <w:rPr>
-          <w:rFonts w:ascii="Calibri" w:cs="Calibri" w:eastAsia="Calibri" w:hAnsi="Calibri"/>
-        </w:rPr>
-        <w:t xml:space="preserve">☐ Make it yours: Section 1, Purpose (generic text: add your details)</w:t>
-      </w:r>
-    </w:p>
-    <w:p>
-      <w:pPr>
-        <w:pStyle w:val="ListParagraph"/>
-        <w:numPr>
-          <w:ilvl w:val="0"/>
-          <w:numId w:val="2"/>
-        </w:numPr>
-        <w:spacing w:after="60" w:line="276"/>
-      </w:pPr>
-      <w:r>
-        <w:rPr>
-          <w:rFonts w:ascii="Calibri" w:cs="Calibri" w:eastAsia="Calibri" w:hAnsi="Calibri"/>
-        </w:rPr>
-        <w:t xml:space="preserve">☐ Make it yours: Section 2, When this procedure applies (generic text: add your details)</w:t>
-      </w:r>
-    </w:p>
-    <w:p>
-      <w:pPr>
-        <w:pStyle w:val="ListParagraph"/>
-        <w:numPr>
-          <w:ilvl w:val="0"/>
-          <w:numId w:val="2"/>
-        </w:numPr>
-        <w:spacing w:after="60" w:line="276"/>
-      </w:pPr>
-      <w:r>
-        <w:rPr>
-          <w:rFonts w:ascii="Calibri" w:cs="Calibri" w:eastAsia="Calibri" w:hAnsi="Calibri"/>
-        </w:rPr>
-        <w:t xml:space="preserve">☐ Make it yours: Section 3, Steps (generic text: add your details)</w:t>
-      </w:r>
-    </w:p>
-    <w:p>
-      <w:pPr>
-        <w:pStyle w:val="ListParagraph"/>
-        <w:numPr>
-          <w:ilvl w:val="0"/>
-          <w:numId w:val="2"/>
-        </w:numPr>
-        <w:spacing w:after="60" w:line="276"/>
-      </w:pPr>
-      <w:r>
-        <w:rPr>
-          <w:rFonts w:ascii="Calibri" w:cs="Calibri" w:eastAsia="Calibri" w:hAnsi="Calibri"/>
-        </w:rPr>
-        <w:t xml:space="preserve">☐ Make it yours: Section 4, Responsibilities (generic text: add your details)</w:t>
-      </w:r>
-    </w:p>
-    <w:p>
-      <w:pPr>
-        <w:pStyle w:val="ListParagraph"/>
-        <w:numPr>
-          <w:ilvl w:val="0"/>
-          <w:numId w:val="2"/>
-        </w:numPr>
-        <w:spacing w:after="60" w:line="276"/>
-      </w:pPr>
-      <w:r>
-        <w:rPr>
-          <w:rFonts w:ascii="Calibri" w:cs="Calibri" w:eastAsia="Calibri" w:hAnsi="Calibri"/>
-        </w:rPr>
-        <w:t xml:space="preserve">☐ Make it yours: Section 5, Training we require (generic text: add your details)</w:t>
-      </w:r>
-    </w:p>
-    <w:p>
-      <w:pPr>
-        <w:pStyle w:val="ListParagraph"/>
-        <w:numPr>
-          <w:ilvl w:val="0"/>
-          <w:numId w:val="2"/>
-        </w:numPr>
-        <w:spacing w:after="60" w:line="276"/>
-      </w:pPr>
-      <w:r>
-        <w:rPr>
-          <w:rFonts w:ascii="Calibri" w:cs="Calibri" w:eastAsia="Calibri" w:hAnsi="Calibri"/>
-        </w:rPr>
-        <w:t xml:space="preserve">Read once: fixed text in sections 6 to 9.</w:t>
+        <w:t xml:space="preserve">12. NDIS Code of Conduct acknowledgement (about 10 minutes; 0 to fill in, 0 to review)</w:t>
+      </w:r>
+    </w:p>
+    <w:p>
+      <w:pPr>
+        <w:pStyle w:val="ListParagraph"/>
+        <w:numPr>
+          <w:ilvl w:val="0"/>
+          <w:numId w:val="2"/>
+        </w:numPr>
+        <w:spacing w:after="60" w:line="276"/>
+      </w:pPr>
+      <w:r>
+        <w:rPr>
+          <w:rFonts w:ascii="Calibri" w:cs="Calibri" w:eastAsia="Calibri" w:hAnsi="Calibri"/>
+        </w:rPr>
+        <w:t xml:space="preserve">Open: code-of-conduct-acknowledgement.docx</w:t>
+      </w:r>
+    </w:p>
+    <w:p>
+      <w:pPr>
+        <w:pStyle w:val="ListParagraph"/>
+        <w:numPr>
+          <w:ilvl w:val="0"/>
+          <w:numId w:val="2"/>
+        </w:numPr>
+        <w:spacing w:after="60" w:line="276"/>
+      </w:pPr>
+      <w:r>
+        <w:rPr>
+          <w:rFonts w:ascii="Calibri" w:cs="Calibri" w:eastAsia="Calibri" w:hAnsi="Calibri"/>
+        </w:rPr>
+        <w:t xml:space="preserve">☐ Make it yours: Section 1, Why we ask you to sign this (generic text: add your details)</w:t>
+      </w:r>
+    </w:p>
+    <w:p>
+      <w:pPr>
+        <w:pStyle w:val="ListParagraph"/>
+        <w:numPr>
+          <w:ilvl w:val="0"/>
+          <w:numId w:val="2"/>
+        </w:numPr>
+        <w:spacing w:after="60" w:line="276"/>
+      </w:pPr>
+      <w:r>
+        <w:rPr>
+          <w:rFonts w:ascii="Calibri" w:cs="Calibri" w:eastAsia="Calibri" w:hAnsi="Calibri"/>
+        </w:rPr>
+        <w:t xml:space="preserve">☐ Make it yours: Section 3, What this means in our work (generic text: add your details)</w:t>
+      </w:r>
+    </w:p>
+    <w:p>
+      <w:pPr>
+        <w:pStyle w:val="ListParagraph"/>
+        <w:numPr>
+          <w:ilvl w:val="0"/>
+          <w:numId w:val="2"/>
+        </w:numPr>
+        <w:spacing w:after="60" w:line="276"/>
+      </w:pPr>
+      <w:r>
+        <w:rPr>
+          <w:rFonts w:ascii="Calibri" w:cs="Calibri" w:eastAsia="Calibri" w:hAnsi="Calibri"/>
+        </w:rPr>
+        <w:t xml:space="preserve">Read once: fixed text in sections 2, 4 to 6.</w:t>
       </w:r>
     </w:p>
     <w:p>
@@ -2751,71 +2811,87 @@
         <w:rPr>
           <w:rFonts w:ascii="Calibri" w:cs="Calibri" w:eastAsia="Calibri" w:hAnsi="Calibri"/>
         </w:rPr>
-        <w:t xml:space="preserve">12. NDIS Code of Conduct acknowledgement (about 10 minutes; 0 to fill in, 0 to review)</w:t>
-      </w:r>
-    </w:p>
-    <w:p>
-      <w:pPr>
-        <w:pStyle w:val="ListParagraph"/>
-        <w:numPr>
-          <w:ilvl w:val="0"/>
-          <w:numId w:val="2"/>
-        </w:numPr>
-        <w:spacing w:after="60" w:line="276"/>
-      </w:pPr>
-      <w:r>
-        <w:rPr>
-          <w:rFonts w:ascii="Calibri" w:cs="Calibri" w:eastAsia="Calibri" w:hAnsi="Calibri"/>
-        </w:rPr>
-        <w:t xml:space="preserve">Open: code-of-conduct-acknowledgement.docx</w:t>
-      </w:r>
-    </w:p>
-    <w:p>
-      <w:pPr>
-        <w:pStyle w:val="ListParagraph"/>
-        <w:numPr>
-          <w:ilvl w:val="0"/>
-          <w:numId w:val="2"/>
-        </w:numPr>
-        <w:spacing w:after="60" w:line="276"/>
-      </w:pPr>
-      <w:r>
-        <w:rPr>
-          <w:rFonts w:ascii="Calibri" w:cs="Calibri" w:eastAsia="Calibri" w:hAnsi="Calibri"/>
-        </w:rPr>
-        <w:t xml:space="preserve">☐ Make it yours: Section 1, Why we ask you to sign this (generic text: add your details)</w:t>
-      </w:r>
-    </w:p>
-    <w:p>
-      <w:pPr>
-        <w:pStyle w:val="ListParagraph"/>
-        <w:numPr>
-          <w:ilvl w:val="0"/>
-          <w:numId w:val="2"/>
-        </w:numPr>
-        <w:spacing w:after="60" w:line="276"/>
-      </w:pPr>
-      <w:r>
-        <w:rPr>
-          <w:rFonts w:ascii="Calibri" w:cs="Calibri" w:eastAsia="Calibri" w:hAnsi="Calibri"/>
-        </w:rPr>
-        <w:t xml:space="preserve">☐ Make it yours: Section 3, What this means in our work (generic text: add your details)</w:t>
-      </w:r>
-    </w:p>
-    <w:p>
-      <w:pPr>
-        <w:pStyle w:val="ListParagraph"/>
-        <w:numPr>
-          <w:ilvl w:val="0"/>
-          <w:numId w:val="2"/>
-        </w:numPr>
-        <w:spacing w:after="60" w:line="276"/>
-      </w:pPr>
-      <w:r>
-        <w:rPr>
-          <w:rFonts w:ascii="Calibri" w:cs="Calibri" w:eastAsia="Calibri" w:hAnsi="Calibri"/>
-        </w:rPr>
-        <w:t xml:space="preserve">Read once: fixed text in sections 2, 4 to 6.</w:t>
+        <w:t xml:space="preserve">13. Service agreement template (about 20 minutes; 0 to fill in, 0 to review)</w:t>
+      </w:r>
+    </w:p>
+    <w:p>
+      <w:pPr>
+        <w:pStyle w:val="ListParagraph"/>
+        <w:numPr>
+          <w:ilvl w:val="0"/>
+          <w:numId w:val="2"/>
+        </w:numPr>
+        <w:spacing w:after="60" w:line="276"/>
+      </w:pPr>
+      <w:r>
+        <w:rPr>
+          <w:rFonts w:ascii="Calibri" w:cs="Calibri" w:eastAsia="Calibri" w:hAnsi="Calibri"/>
+        </w:rPr>
+        <w:t xml:space="preserve">Open: service-agreement-template.docx</w:t>
+      </w:r>
+    </w:p>
+    <w:p>
+      <w:pPr>
+        <w:pStyle w:val="ListParagraph"/>
+        <w:numPr>
+          <w:ilvl w:val="0"/>
+          <w:numId w:val="2"/>
+        </w:numPr>
+        <w:spacing w:after="60" w:line="276"/>
+      </w:pPr>
+      <w:r>
+        <w:rPr>
+          <w:rFonts w:ascii="Calibri" w:cs="Calibri" w:eastAsia="Calibri" w:hAnsi="Calibri"/>
+        </w:rPr>
+        <w:t xml:space="preserve">☐ Make it yours: Section 2, Parties (generic text: add your details)</w:t>
+      </w:r>
+    </w:p>
+    <w:p>
+      <w:pPr>
+        <w:pStyle w:val="ListParagraph"/>
+        <w:numPr>
+          <w:ilvl w:val="0"/>
+          <w:numId w:val="2"/>
+        </w:numPr>
+        <w:spacing w:after="60" w:line="276"/>
+      </w:pPr>
+      <w:r>
+        <w:rPr>
+          <w:rFonts w:ascii="Calibri" w:cs="Calibri" w:eastAsia="Calibri" w:hAnsi="Calibri"/>
+        </w:rPr>
+        <w:t xml:space="preserve">☐ Make it yours: Section 3, Agreement terms (generic text: add your details)</w:t>
+      </w:r>
+    </w:p>
+    <w:p>
+      <w:pPr>
+        <w:pStyle w:val="ListParagraph"/>
+        <w:numPr>
+          <w:ilvl w:val="0"/>
+          <w:numId w:val="2"/>
+        </w:numPr>
+        <w:spacing w:after="60" w:line="276"/>
+      </w:pPr>
+      <w:r>
+        <w:rPr>
+          <w:rFonts w:ascii="Calibri" w:cs="Calibri" w:eastAsia="Calibri" w:hAnsi="Calibri"/>
+        </w:rPr>
+        <w:t xml:space="preserve">☐ Make it yours: Section 4, Easy-read summary (generic text: add your details)</w:t>
+      </w:r>
+    </w:p>
+    <w:p>
+      <w:pPr>
+        <w:pStyle w:val="ListParagraph"/>
+        <w:numPr>
+          <w:ilvl w:val="0"/>
+          <w:numId w:val="2"/>
+        </w:numPr>
+        <w:spacing w:after="60" w:line="276"/>
+      </w:pPr>
+      <w:r>
+        <w:rPr>
+          <w:rFonts w:ascii="Calibri" w:cs="Calibri" w:eastAsia="Calibri" w:hAnsi="Calibri"/>
+        </w:rPr>
+        <w:t xml:space="preserve">Read once: fixed text in sections 1, 5 to 7.</w:t>
       </w:r>
     </w:p>
     <w:p>
@@ -2842,144 +2918,6 @@
         <w:rPr>
           <w:rFonts w:ascii="Calibri" w:cs="Calibri" w:eastAsia="Calibri" w:hAnsi="Calibri"/>
         </w:rPr>
-        <w:t xml:space="preserve">13. Service agreement template (about 20 minutes; 0 to fill in, 0 to review)</w:t>
-      </w:r>
-    </w:p>
-    <w:p>
-      <w:pPr>
-        <w:pStyle w:val="ListParagraph"/>
-        <w:numPr>
-          <w:ilvl w:val="0"/>
-          <w:numId w:val="2"/>
-        </w:numPr>
-        <w:spacing w:after="60" w:line="276"/>
-      </w:pPr>
-      <w:r>
-        <w:rPr>
-          <w:rFonts w:ascii="Calibri" w:cs="Calibri" w:eastAsia="Calibri" w:hAnsi="Calibri"/>
-        </w:rPr>
-        <w:t xml:space="preserve">Open: service-agreement-template.docx</w:t>
-      </w:r>
-    </w:p>
-    <w:p>
-      <w:pPr>
-        <w:pStyle w:val="ListParagraph"/>
-        <w:numPr>
-          <w:ilvl w:val="0"/>
-          <w:numId w:val="2"/>
-        </w:numPr>
-        <w:spacing w:after="60" w:line="276"/>
-      </w:pPr>
-      <w:r>
-        <w:rPr>
-          <w:rFonts w:ascii="Calibri" w:cs="Calibri" w:eastAsia="Calibri" w:hAnsi="Calibri"/>
-        </w:rPr>
-        <w:t xml:space="preserve">☐ Fill in Word: Easy Read version: </w:t>
-      </w:r>
-      <w:r>
-        <w:rPr>
-          <w:rFonts w:ascii="Calibri" w:cs="Calibri" w:eastAsia="Calibri" w:hAnsi="Calibri"/>
-          <w:sz w:val="24"/>
-          <w:szCs w:val="24"/>
-          <w:shd w:fill="FBE9D7" w:val="clear"/>
-        </w:rPr>
-        <w:t xml:space="preserve">[Easy Read version]</w:t>
-      </w:r>
-      <w:r>
-        <w:rPr>
-          <w:rFonts w:ascii="Calibri" w:cs="Calibri" w:eastAsia="Calibri" w:hAnsi="Calibri"/>
-        </w:rPr>
-        <w:t xml:space="preserve"> (fill this in Word)</w:t>
-      </w:r>
-    </w:p>
-    <w:p>
-      <w:pPr>
-        <w:pStyle w:val="ListParagraph"/>
-        <w:numPr>
-          <w:ilvl w:val="0"/>
-          <w:numId w:val="2"/>
-        </w:numPr>
-        <w:spacing w:after="60" w:line="276"/>
-      </w:pPr>
-      <w:r>
-        <w:rPr>
-          <w:rFonts w:ascii="Calibri" w:cs="Calibri" w:eastAsia="Calibri" w:hAnsi="Calibri"/>
-        </w:rPr>
-        <w:t xml:space="preserve">☐ Make it yours: Section 2, Parties (generic text: add your details)</w:t>
-      </w:r>
-    </w:p>
-    <w:p>
-      <w:pPr>
-        <w:pStyle w:val="ListParagraph"/>
-        <w:numPr>
-          <w:ilvl w:val="0"/>
-          <w:numId w:val="2"/>
-        </w:numPr>
-        <w:spacing w:after="60" w:line="276"/>
-      </w:pPr>
-      <w:r>
-        <w:rPr>
-          <w:rFonts w:ascii="Calibri" w:cs="Calibri" w:eastAsia="Calibri" w:hAnsi="Calibri"/>
-        </w:rPr>
-        <w:t xml:space="preserve">☐ Make it yours: Section 3, Agreement terms (generic text: add your details)</w:t>
-      </w:r>
-    </w:p>
-    <w:p>
-      <w:pPr>
-        <w:pStyle w:val="ListParagraph"/>
-        <w:numPr>
-          <w:ilvl w:val="0"/>
-          <w:numId w:val="2"/>
-        </w:numPr>
-        <w:spacing w:after="60" w:line="276"/>
-      </w:pPr>
-      <w:r>
-        <w:rPr>
-          <w:rFonts w:ascii="Calibri" w:cs="Calibri" w:eastAsia="Calibri" w:hAnsi="Calibri"/>
-        </w:rPr>
-        <w:t xml:space="preserve">☐ Make it yours: Section 4, Easy-read summary (generic text: add your details)</w:t>
-      </w:r>
-    </w:p>
-    <w:p>
-      <w:pPr>
-        <w:pStyle w:val="ListParagraph"/>
-        <w:numPr>
-          <w:ilvl w:val="0"/>
-          <w:numId w:val="2"/>
-        </w:numPr>
-        <w:spacing w:after="60" w:line="276"/>
-      </w:pPr>
-      <w:r>
-        <w:rPr>
-          <w:rFonts w:ascii="Calibri" w:cs="Calibri" w:eastAsia="Calibri" w:hAnsi="Calibri"/>
-        </w:rPr>
-        <w:t xml:space="preserve">Read once: fixed text in sections 1, 5 to 7.</w:t>
-      </w:r>
-    </w:p>
-    <w:p>
-      <w:pPr>
-        <w:pStyle w:val="ListParagraph"/>
-        <w:numPr>
-          <w:ilvl w:val="0"/>
-          <w:numId w:val="2"/>
-        </w:numPr>
-        <w:spacing w:after="60" w:line="276"/>
-      </w:pPr>
-      <w:r>
-        <w:rPr>
-          <w:rFonts w:ascii="Calibri" w:cs="Calibri" w:eastAsia="Calibri" w:hAnsi="Calibri"/>
-        </w:rPr>
-        <w:t xml:space="preserve">☐ Adopt: sign and date the document control table, then mark it adopted on your documents page.</w:t>
-      </w:r>
-    </w:p>
-    <w:p>
-      <w:pPr>
-        <w:spacing w:after="120" w:line="276"/>
-      </w:pPr>
-      <w:r>
-        <w:rPr>
-          <w:rFonts w:ascii="Calibri" w:cs="Calibri" w:eastAsia="Calibri" w:hAnsi="Calibri"/>
-        </w:rPr>
         <w:t xml:space="preserve">14. Participant rights, choice and control policy (about 20 minutes; 0 to fill in, 0 to review)</w:t>
       </w:r>
     </w:p>
@@ -2997,37 +2935,6 @@
           <w:rFonts w:ascii="Calibri" w:cs="Calibri" w:eastAsia="Calibri" w:hAnsi="Calibri"/>
         </w:rPr>
         <w:t xml:space="preserve">Open: participant-rights-and-choice-policy.docx</w:t>
-      </w:r>
-    </w:p>
-    <w:p>
-      <w:pPr>
-        <w:pStyle w:val="ListParagraph"/>
-        <w:numPr>
-          <w:ilvl w:val="0"/>
-          <w:numId w:val="2"/>
-        </w:numPr>
-        <w:spacing w:after="60" w:line="276"/>
-      </w:pPr>
-      <w:r>
-        <w:rPr>
-          <w:rFonts w:ascii="Calibri" w:cs="Calibri" w:eastAsia="Calibri" w:hAnsi="Calibri"/>
-        </w:rPr>
-        <w:t xml:space="preserve">☐ Fill in Word: Easy Read version: </w:t>
-      </w:r>
-      <w:r>
-        <w:rPr>
-          <w:rFonts w:ascii="Calibri" w:cs="Calibri" w:eastAsia="Calibri" w:hAnsi="Calibri"/>
-          <w:sz w:val="24"/>
-          <w:szCs w:val="24"/>
-          <w:shd w:fill="FBE9D7" w:val="clear"/>
-        </w:rPr>
-        <w:t xml:space="preserve">[Easy Read version]</w:t>
-      </w:r>
-      <w:r>
-        <w:rPr>
-          <w:rFonts w:ascii="Calibri" w:cs="Calibri" w:eastAsia="Calibri" w:hAnsi="Calibri"/>
-        </w:rPr>
-        <w:t xml:space="preserve"> (fill this in Word)</w:t>
       </w:r>
     </w:p>
     <w:p>
@@ -3531,6 +3438,22 @@
           <w:rFonts w:ascii="Calibri" w:cs="Calibri" w:eastAsia="Calibri" w:hAnsi="Calibri"/>
         </w:rPr>
         <w:t xml:space="preserve">See what the auditor asks for on the day: /path/audit-day</w:t>
+      </w:r>
+    </w:p>
+    <w:p>
+      <w:pPr>
+        <w:pStyle w:val="ListParagraph"/>
+        <w:numPr>
+          <w:ilvl w:val="0"/>
+          <w:numId w:val="4"/>
+        </w:numPr>
+        <w:spacing w:after="60" w:line="276"/>
+      </w:pPr>
+      <w:r>
+        <w:rPr>
+          <w:rFonts w:ascii="Calibri" w:cs="Calibri" w:eastAsia="Calibri" w:hAnsi="Calibri"/>
+        </w:rPr>
+        <w:t xml:space="preserve">Check your systems before the audit: /path/audit-day/check</w:t>
       </w:r>
     </w:p>
     <w:sectPr>

</xml_diff>